<commit_message>
Publish clean portfolio and CV
</commit_message>
<xml_diff>
--- a/Phomello-CV.docx
+++ b/Phomello-CV.docx
@@ -988,6 +988,7 @@
         </w:r>
       </w:hyperlink>
       <w:hyperlink r:id="rId20">
+        <w:proofErr w:type="spellStart"/>
         <w:r>
           <w:rPr>
             <w:rFonts w:ascii="Arial" w:eastAsia="Arial" w:hAnsi="Arial" w:cs="Arial"/>
@@ -1008,6 +1009,7 @@
           </w:rPr>
           <w:t>s</w:t>
         </w:r>
+        <w:proofErr w:type="spellEnd"/>
       </w:hyperlink>
       <w:hyperlink r:id="rId22">
         <w:r>
@@ -1179,23 +1181,7 @@
         </w:r>
       </w:hyperlink>
       <w:r>
-        <w:rPr>
-          <w:rFonts w:ascii="Segoe UI" w:hAnsi="Segoe UI" w:cs="Segoe UI"/>
-          <w:b/>
-          <w:bCs/>
-          <w:color w:val="F0F6FC"/>
-          <w:sz w:val="21"/>
-          <w:szCs w:val="21"/>
-          <w:shd w:val="clear" w:color="auto" w:fill="0D1117"/>
-        </w:rPr>
-        <w:t xml:space="preserve"> </w:t>
-      </w:r>
-      <w:r>
-        <w:rPr>
-          <w:b/>
-          <w:bCs/>
-        </w:rPr>
-        <w:t> </w:t>
+        <w:t xml:space="preserve"> </w:t>
       </w:r>
       <w:hyperlink r:id="rId27" w:history="1">
         <w:r>
@@ -1204,12 +1190,44 @@
             <w:rFonts w:ascii="Arial" w:hAnsi="Arial" w:cs="Arial"/>
             <w:b/>
             <w:bCs/>
-            <w:sz w:val="24"/>
+            <w:sz w:val="28"/>
             <w:szCs w:val="28"/>
           </w:rPr>
-          <w:t>Phomello Lesetja Mokonyane | IT Portfolio</w:t>
+          <w:t>https://phomello-mokonyane.gi</w:t>
+        </w:r>
+        <w:r>
+          <w:rPr>
+            <w:rStyle w:val="Hyperlink"/>
+            <w:rFonts w:ascii="Arial" w:hAnsi="Arial" w:cs="Arial"/>
+            <w:b/>
+            <w:bCs/>
+            <w:sz w:val="28"/>
+            <w:szCs w:val="28"/>
+          </w:rPr>
+          <w:t>t</w:t>
+        </w:r>
+        <w:r>
+          <w:rPr>
+            <w:rStyle w:val="Hyperlink"/>
+            <w:rFonts w:ascii="Arial" w:hAnsi="Arial" w:cs="Arial"/>
+            <w:b/>
+            <w:bCs/>
+            <w:sz w:val="28"/>
+            <w:szCs w:val="28"/>
+          </w:rPr>
+          <w:t>hub.io/Phomello-Portfolio/</w:t>
         </w:r>
       </w:hyperlink>
+      <w:r>
+        <w:rPr>
+          <w:rFonts w:ascii="Arial" w:hAnsi="Arial" w:cs="Arial"/>
+          <w:b/>
+          <w:bCs/>
+          <w:sz w:val="24"/>
+          <w:szCs w:val="28"/>
+        </w:rPr>
+        <w:t xml:space="preserve"> </w:t>
+      </w:r>
     </w:p>
     <w:p>
       <w:pPr>
@@ -2850,25 +2868,13 @@
       </w:pPr>
       <w:r>
         <w:lastRenderedPageBreak/>
-        <w:t xml:space="preserve">Project </w:t>
-      </w:r>
-      <w:r>
-        <w:t>4</w:t>
-      </w:r>
-      <w:r>
-        <w:t xml:space="preserve"> Title </w:t>
+        <w:t xml:space="preserve">Project 4 Title </w:t>
       </w:r>
       <w:r>
         <w:rPr>
           <w:b w:val="0"/>
         </w:rPr>
-        <w:t>–</w:t>
-      </w:r>
-      <w:r>
-        <w:rPr>
-          <w:b w:val="0"/>
-        </w:rPr>
-        <w:t xml:space="preserve"> </w:t>
+        <w:t xml:space="preserve">– </w:t>
       </w:r>
       <w:r>
         <w:t>Personal AI Agent (Jarvis)</w:t>
@@ -3779,25 +3785,7 @@
           <w:sz w:val="28"/>
         </w:rPr>
         <w:lastRenderedPageBreak/>
-        <w:t xml:space="preserve">Created editorial sections (Manifesto, Works, Studio, Contact CTA) with interactive hover states, sticky storytelling, and brutalist premium typography </w:t>
-      </w:r>
-      <w:r>
-        <w:rPr>
-          <w:rFonts w:ascii="Arial" w:hAnsi="Arial" w:cs="Arial"/>
-          <w:iCs/>
-          <w:color w:val="3A3A3A" w:themeColor="background2" w:themeShade="40"/>
-          <w:sz w:val="28"/>
-        </w:rPr>
-        <w:t>like</w:t>
-      </w:r>
-      <w:r>
-        <w:rPr>
-          <w:rFonts w:ascii="Arial" w:hAnsi="Arial" w:cs="Arial"/>
-          <w:iCs/>
-          <w:color w:val="3A3A3A" w:themeColor="background2" w:themeShade="40"/>
-          <w:sz w:val="28"/>
-        </w:rPr>
-        <w:t xml:space="preserve"> high-end agency sites.</w:t>
+        <w:t>Created editorial sections (Manifesto, Works, Studio, Contact CTA) with interactive hover states, sticky storytelling, and brutalist premium typography like high-end agency sites.</w:t>
       </w:r>
     </w:p>
     <w:p>

</xml_diff>